<commit_message>
test: define model runtime scope and durable recovery contracts
</commit_message>
<xml_diff>
--- a/docs/IMPLEMENTATION_GOAL.docx
+++ b/docs/IMPLEMENTATION_GOAL.docx
@@ -4330,7 +4330,7 @@
           <w:b w:val="0"/>
           <w:i w:val="0"/>
         </w:rPr>
-        <w:t xml:space="preserve"> as though an unsigned archive automatically provides a free signed export. Sideloadly performs signing later on Windows. Packaging a simulator </w:t>
+        <w:t xml:space="preserve"> as though an unsigned archive automatically provides a free signed export. iLoader performs signing later on Windows. Packaging a simulator </w:t>
       </w:r>
       <w:r>
         <w:rPr>
@@ -4548,7 +4548,7 @@
           <w:b w:val="0"/>
           <w:i w:val="0"/>
         </w:rPr>
-        <w:t xml:space="preserve">Create </w:t>
+        <w:t xml:space="preserve">Create docs/WINDOWS_INSTALL.md as an implementation deliverable using iLoader for Windows. The owner reported a successful iLoader installation on 24 October 2026 and selected it as the project installation tool. Recheck current iLoader prerequisites instead of hardcoding Apple component download URLs. Apple Personal Team signing still requires seven-day renewal; installation alone does not verify the embedded extension or renewal persistence. [S1, S22]</w:t>
       </w:r>
       <w:r>
         <w:rPr>
@@ -4557,14 +4557,14 @@
           <w:i w:val="0"/>
           <w:sz w:val="16"/>
         </w:rPr>
-        <w:t>docs/WINDOWS_INSTALL.md</w:t>
-      </w:r>
-      <w:r>
-        <w:rPr>
-          <w:b w:val="0"/>
-          <w:i w:val="0"/>
-        </w:rPr>
-        <w:t xml:space="preserve"> as an implementation deliverable, with exact steps verified against the current Sideloadly instructions. The current official site documents free-account signing and seven-day validity; its prerequisites can change, so do not hardcode outdated Apple component download URLs. [S22]</w:t>
+        <w:t/>
+      </w:r>
+      <w:r>
+        <w:rPr>
+          <w:b w:val="0"/>
+          <w:i w:val="0"/>
+        </w:rPr>
+        <w:t xml:space="preserve"/>
       </w:r>
     </w:p>
     <w:p>
@@ -4574,7 +4574,7 @@
           <w:b w:val="0"/>
           <w:i w:val="0"/>
         </w:rPr>
-        <w:t>The installation procedure must explain: install the official Windows prerequisites, connect and trust the iPhone, select the downloaded unsigned IPA, authenticate with the Apple Account locally in Sideloadly, preserve the embedded Live Activity extension, complete device profile trust/Developer Mode where required, then launch the app while unlocked for onboarding. Apple describes Developer Mode for running development applications. [S23]</w:t>
+        <w:t>The installation procedure must explain: install the official Windows prerequisites, connect and trust the iPhone, select the downloaded unsigned IPA, authenticate with the Apple Account locally in iLoader, preserve the embedded Live Activity extension, complete device profile trust/Developer Mode where required, then launch the app while unlocked for onboarding. Apple describes Developer Mode for running development applications. [S23]</w:t>
       </w:r>
     </w:p>
     <w:p>
@@ -5927,7 +5927,7 @@
           <w:b w:val="0"/>
           <w:i w:val="0"/>
         </w:rPr>
-        <w:t>Sources below were consulted for this specification on 23 October 2026. Recheck relevant API availability, model artifacts, upstream build instructions, free-signing behavior, runner images, and billing before implementing a version-sensitive step. Preserve the chosen versions and actual observations in the project. Documentation establishes supported concepts, not successful end-to-end device behavior.</w:t>
+        <w:t>Sources were consulted on 23 October 2026; the iLoader installation source was updated on 24 October 2026 after the owner reported success. Recheck relevant API availability, model artifacts, upstream build instructions, free-signing behavior, runner images, and billing before implementing a version-sensitive step. Preserve the chosen versions and actual observations in the project. Documentation establishes supported concepts, not successful end-to-end device behavior.</w:t>
       </w:r>
     </w:p>
     <w:p>
@@ -6352,7 +6352,7 @@
           <w:b w:val="0"/>
           <w:i w:val="0"/>
         </w:rPr>
-        <w:t xml:space="preserve">[S22] Sideloadly, official site and FAQ: </w:t>
+        <w:t xml:space="preserve">[S22] iLoader, official site and repository: </w:t>
       </w:r>
       <w:hyperlink r:id="rId33">
         <w:r>

</xml_diff>